<commit_message>
v9.5: fresh-session protocol, exercised fn allowlist (image/label signals), wall-independent marginal KPI; between-session finding documented
</commit_message>
<xml_diff>
--- a/Milestone-1_SAQEF_Methodology_and_Fn_Results.docx
+++ b/Milestone-1_SAQEF_Methodology_and_Fn_Results.docx
@@ -1922,6 +1922,18 @@
     </w:p>
     <w:p>
       <w:pPr>
+        <w:spacing w:after="120"/>
+      </w:pPr>
+      <w:r>
+        <w:rPr>
+          <w:b w:val="0"/>
+          <w:i/>
+        </w:rPr>
+        <w:t>v9.5 corrections (between-session finding): two nominally identical sessions differed 3.2x in wall/rps/KPI, i.e. between-session spread (not the within-session cv/iqr). Root-cause candidate: leftover warm function containers from a reused fnserver folding into fn_cpu under the denylist. Fixes: (m) fresh-session protocol — run_saqef.sh reset + setup restart fnserver and remove orphaned fnproject/python:3.12 containers; (n) the classification allowlist is now EXERCISED — image/label signals (--fn-images/--fn-labels/--cp-images/--cp-labels) added and --fn-images fnproject/python:3.12 passed by default, so unclassified_cpu_s is informative instead of a guaranteed 0.0; (o) marginal KPI kpi_gco2_per_inv_dynamic (load-created carbon only) is wall-independent, unlike the ~93%-idle-dominated operational KPI; (p) neither session's absolute numbers are quoted in isolation — bare-metal multi-session medians required.</w:t>
+      </w:r>
+    </w:p>
+    <w:p>
+      <w:pPr>
         <w:pStyle w:val="Heading1"/>
       </w:pPr>
       <w:r>

</xml_diff>